<commit_message>
Phase 1 : completed the project structure and the database connections are done and tested
</commit_message>
<xml_diff>
--- a/docs/Implementation_Plan.docx
+++ b/docs/Implementation_Plan.docx
@@ -29,7 +29,7 @@
         <w:spacing w:after="80"/>
       </w:pPr>
       <w:r>
-        <w:t>Plan version: 2.3</w:t>
+        <w:t>Plan version: 2.6</w:t>
       </w:r>
     </w:p>
     <w:p>
@@ -195,13 +195,13 @@
         <w:tab/>
         <w:t>5</w:t>
         <w:br/>
-        <w:t>5. Phase 1 — Supabase and service credentials</w:t>
+        <w:t>5. Phase 1 — Database, authentication and service configuration</w:t>
         <w:tab/>
         <w:t>5</w:t>
         <w:br/>
         <w:t>6. Phase 2 — Backend foundation and accounting core</w:t>
         <w:tab/>
-        <w:t>5</w:t>
+        <w:t>6</w:t>
         <w:br/>
         <w:t>7. Phase 3 — All P1 backend modules and APIs</w:t>
         <w:tab/>
@@ -209,7 +209,7 @@
         <w:br/>
         <w:t>8. Phase 4 — Backend verification: pytest and Swagger UI</w:t>
         <w:tab/>
-        <w:t>6</w:t>
+        <w:t>7</w:t>
         <w:br/>
         <w:t>9. Phase 5 — Build responsive web frontend</w:t>
         <w:tab/>
@@ -217,11 +217,11 @@
         <w:br/>
         <w:t>10. Phase 6 — UI-only testing</w:t>
         <w:tab/>
-        <w:t>7</w:t>
+        <w:t>8</w:t>
         <w:br/>
         <w:t>11. Phase 7 — Integrate frontend and APIs</w:t>
         <w:tab/>
-        <w:t>7</w:t>
+        <w:t>8</w:t>
         <w:br/>
         <w:t>12. Phase 8 — Integration testing</w:t>
         <w:tab/>
@@ -233,11 +233,11 @@
         <w:br/>
         <w:t>14. Phase 10 — Deployed system and E2E testing</w:t>
         <w:tab/>
-        <w:t>8</w:t>
+        <w:t>9</w:t>
         <w:br/>
         <w:t>15. Phase 11 — Public developer API and SDK</w:t>
         <w:tab/>
-        <w:t>8</w:t>
+        <w:t>9</w:t>
         <w:br/>
         <w:t>16. Phase 12 — Commercial production, scale and ongoing operations</w:t>
         <w:tab/>
@@ -249,11 +249,11 @@
         <w:br/>
         <w:t>18. Quality gates and project workflow</w:t>
         <w:tab/>
-        <w:t>9</w:t>
+        <w:t>10</w:t>
         <w:br/>
         <w:t>19. Launch checklist and change record</w:t>
         <w:tab/>
-        <w:t>9</w:t>
+        <w:t>10</w:t>
         <w:br/>
         <w:t>20. Current implementation progress tracker</w:t>
         <w:tab/>
@@ -2388,18 +2388,12 @@
         <w:pageBreakBefore w:val="0"/>
       </w:pPr>
       <w:r>
-        <w:t>5. Phase 1 — Supabase and service credentials</w:t>
+        <w:t>5. Phase 1 — Database, authentication and service configuration</w:t>
       </w:r>
     </w:p>
     <w:p>
       <w:r>
-        <w:rPr>
-          <w:b/>
-        </w:rPr>
-        <w:t>Purpose:</w:t>
-      </w:r>
-      <w:r>
-        <w:t xml:space="preserve"> Set up selected services and keys before database-backed feature work.</w:t>
+        <w:t>Purpose: Set up selected services and keys before database-backed feature work.</w:t>
       </w:r>
     </w:p>
     <w:p>
@@ -2407,7 +2401,7 @@
         <w:ind w:left="360" w:hanging="317"/>
       </w:pPr>
       <w:r>
-        <w:t>1. Confirm identity authority. FastAPI-owned auth is the SRS default; Supabase Auth requires an approved ADR and SRS/test updates.</w:t>
+        <w:t>1. Use FastAPI-owned authentication; Supabase Auth is not in scope unless an ADR and SRS/session contract are approved. Follow the SRS: 10-minute access-token expiry, HttpOnly/Secure cookie on the API origin, CSRF and strict Origin checks, no bearer token in localStorage, refresh rotation, revocation, MFA and audited recovery. The selected design is short-lived JWT access plus server-stored, hashed, rotated refresh tokens.</w:t>
       </w:r>
     </w:p>
     <w:p>
@@ -2415,7 +2409,7 @@
         <w:ind w:left="360" w:hanging="317"/>
       </w:pPr>
       <w:r>
-        <w:t>2. Create isolated development and test/staging Supabase projects or databases when quotas permit; create a separate demo environment later.</w:t>
+        <w:t>2. Use the existing local Docker Compose PostgreSQL for this phase. Do not provision a hosted database now; revisit hosted PostgreSQL at deployment after current cost, quota, network, backup and recovery review.</w:t>
       </w:r>
     </w:p>
     <w:p>
@@ -2423,7 +2417,7 @@
         <w:ind w:left="360" w:hanging="317"/>
       </w:pPr>
       <w:r>
-        <w:t>3. Select TLS connection mode, role/grant model and connection pool behavior. Keep migration and runtime credentials separate.</w:t>
+        <w:t>3. Separate database roles: Compose bootstrap administrator, least-privileged application runtime role, and schema migration role. The API uses only the runtime role; migration credentials stay in an operator/migration context. Select pool behavior and exact grants, then verify privilege separation.</w:t>
       </w:r>
     </w:p>
     <w:p>
@@ -2431,7 +2425,7 @@
         <w:ind w:left="360" w:hanging="317"/>
       </w:pPr>
       <w:r>
-        <w:t>4. Enable RLS for tenant-owned data; use least-privilege runtime DB role and verify it does not bypass policies. Test tenant context through real backend sessions.</w:t>
+        <w:t>4. Defer tenant RLS policies and real-session cross-tenant tests until Phase 2 creates the tenant schema. Do not claim tenant isolation from an empty database.</w:t>
       </w:r>
     </w:p>
     <w:p>
@@ -2476,24 +2470,12 @@
     </w:p>
     <w:p>
       <w:r>
-        <w:rPr>
-          <w:b/>
-        </w:rPr>
-        <w:t>Deliverables:</w:t>
-      </w:r>
-      <w:r>
-        <w:t xml:space="preserve"> Environment/service inventory, approved auth decision, RLS/roles plan, protected credentials and rotation notes.  </w:t>
+        <w:t>Deliverables: Phase 1 service setup and credential inventory, approved browser auth contract, local credential helper and runtime validation, verified runtime/migration roles and connection strings, real role/password-rotation checks and CI definitions.</w:t>
       </w:r>
     </w:p>
     <w:p>
       <w:r>
-        <w:rPr>
-          <w:b/>
-        </w:rPr>
-        <w:t>Exit gate:</w:t>
-      </w:r>
-      <w:r>
-        <w:t xml:space="preserve"> Secure test DB connection and tenant isolation pass; environments are separated; no paid service blocks tests.</w:t>
+        <w:t>Exit gate: Local PostgreSQL is healthy; app and migration roles are separate and verified; the API runtime uses only the restricted app role; secrets stay local and ignored; free local test workflow is documented. Tenant RLS and cross-tenant tests are a Phase 2 exit gate after tenant schema exists.</w:t>
       </w:r>
     </w:p>
     <w:p>
@@ -3708,7 +3690,7 @@
     </w:p>
     <w:p>
       <w:r>
-        <w:t>Every PR: SRS-linked acceptance, review, locked dependencies, Ruff/type checks, pytest/coverage, migration check, frontend production build, API container build, secret/dependency scan and test evidence. Protect main and require backend, frontend and container CI checks before merge. Vercel deploys web previews/production through Git integration. The AWS demo job runs only from main after required CI jobs pass, using OIDC, ECR and SSM; deployment requires protected environment variables and a bootstrapped EC2 host. Every release: compatible additive migration, OpenAPI compatibility, auth/TLS/CORS/cookie checks, tenant tests, backup/rollback/export plan and core workflow smoke tests.</w:t>
+        <w:t>Every PR: SRS-linked acceptance, review, locked dependencies, Ruff/type checks, pytest/coverage, migration check, frontend production build, API container build, secret/dependency scan and test evidence. Protect the default branch and require backend, frontend and container CI checks before merge. Vercel deploys web previews/production through Git integration. The AWS demo deploys from the default branch after CI passes, using OIDC, ECR and SSM; deployment requires protected environment variables and a bootstrapped EC2 host. Every release: compatible additive migration, OpenAPI compatibility, auth/TLS/CORS/cookie checks, tenant tests, backup/rollback/export plan and core workflow smoke tests.</w:t>
       </w:r>
     </w:p>
     <w:p>
@@ -3751,7 +3733,7 @@
         <w:pStyle w:val="ListBullet"/>
       </w:pPr>
       <w:r>
-        <w:t>☐ Supabase/Auth ownership, RLS, service roles and key rotation are verified.</w:t>
+        <w:t>☐ Selected identity ownership, session lifecycle, tenant RLS, service roles and key rotation are verified in their implementation phases.</w:t>
       </w:r>
     </w:p>
     <w:p>
@@ -3847,12 +3829,13 @@
         <w:tblStyle w:val="LightShading-Accent1"/>
         <w:tblW w:type="auto" w:w="0"/>
         <w:jc w:val="center"/>
+        <w:tblLayout w:type="fixed"/>
         <w:tblLook w:firstColumn="1" w:firstRow="1" w:lastColumn="0" w:lastRow="0" w:noHBand="0" w:noVBand="1" w:val="04A0"/>
       </w:tblPr>
       <w:tblGrid>
-        <w:gridCol w:w="3331"/>
-        <w:gridCol w:w="3331"/>
-        <w:gridCol w:w="3331"/>
+        <w:gridCol w:w="1008"/>
+        <w:gridCol w:w="1800"/>
+        <w:gridCol w:w="7186"/>
       </w:tblGrid>
       <w:tr>
         <w:trPr>
@@ -3860,7 +3843,7 @@
         </w:trPr>
         <w:tc>
           <w:tcPr>
-            <w:tcW w:type="dxa" w:w="3331"/>
+            <w:tcW w:type="dxa" w:w="1008"/>
             <w:vAlign w:val="top"/>
           </w:tcPr>
           <w:p>
@@ -3870,13 +3853,13 @@
             <w:r>
               <w:rPr>
                 <w:b/>
-                <w:sz w:val="16"/>
+                <w:sz w:val="18"/>
               </w:rPr>
             </w:r>
             <w:r>
               <w:rPr>
                 <w:b/>
-                <w:sz w:val="16"/>
+                <w:sz w:val="18"/>
               </w:rPr>
               <w:t>Version</w:t>
             </w:r>
@@ -3884,7 +3867,7 @@
         </w:tc>
         <w:tc>
           <w:tcPr>
-            <w:tcW w:type="dxa" w:w="3331"/>
+            <w:tcW w:type="dxa" w:w="1800"/>
             <w:vAlign w:val="top"/>
           </w:tcPr>
           <w:p>
@@ -3894,13 +3877,13 @@
             <w:r>
               <w:rPr>
                 <w:b/>
-                <w:sz w:val="16"/>
+                <w:sz w:val="18"/>
               </w:rPr>
             </w:r>
             <w:r>
               <w:rPr>
                 <w:b/>
-                <w:sz w:val="16"/>
+                <w:sz w:val="18"/>
               </w:rPr>
               <w:t>Date</w:t>
             </w:r>
@@ -3908,7 +3891,7 @@
         </w:tc>
         <w:tc>
           <w:tcPr>
-            <w:tcW w:type="dxa" w:w="3331"/>
+            <w:tcW w:type="dxa" w:w="7186"/>
             <w:vAlign w:val="top"/>
           </w:tcPr>
           <w:p>
@@ -3918,13 +3901,13 @@
             <w:r>
               <w:rPr>
                 <w:b/>
-                <w:sz w:val="16"/>
+                <w:sz w:val="18"/>
               </w:rPr>
             </w:r>
             <w:r>
               <w:rPr>
                 <w:b/>
-                <w:sz w:val="16"/>
+                <w:sz w:val="18"/>
               </w:rPr>
               <w:t>Change</w:t>
             </w:r>
@@ -3937,7 +3920,7 @@
         </w:trPr>
         <w:tc>
           <w:tcPr>
-            <w:tcW w:type="dxa" w:w="3331"/>
+            <w:tcW w:type="dxa" w:w="1008"/>
             <w:vAlign w:val="top"/>
           </w:tcPr>
           <w:p>
@@ -3946,12 +3929,12 @@
             </w:pPr>
             <w:r>
               <w:rPr>
-                <w:sz w:val="16"/>
+                <w:sz w:val="18"/>
               </w:rPr>
             </w:r>
             <w:r>
               <w:rPr>
-                <w:sz w:val="16"/>
+                <w:sz w:val="18"/>
               </w:rPr>
               <w:t>1.0</w:t>
             </w:r>
@@ -3959,7 +3942,7 @@
         </w:tc>
         <w:tc>
           <w:tcPr>
-            <w:tcW w:type="dxa" w:w="3331"/>
+            <w:tcW w:type="dxa" w:w="1800"/>
             <w:vAlign w:val="top"/>
           </w:tcPr>
           <w:p>
@@ -3968,12 +3951,12 @@
             </w:pPr>
             <w:r>
               <w:rPr>
-                <w:sz w:val="16"/>
+                <w:sz w:val="18"/>
               </w:rPr>
             </w:r>
             <w:r>
               <w:rPr>
-                <w:sz w:val="16"/>
+                <w:sz w:val="18"/>
               </w:rPr>
               <w:t>26 Oct 2026</w:t>
             </w:r>
@@ -3981,7 +3964,7 @@
         </w:tc>
         <w:tc>
           <w:tcPr>
-            <w:tcW w:type="dxa" w:w="3331"/>
+            <w:tcW w:type="dxa" w:w="7186"/>
             <w:vAlign w:val="top"/>
           </w:tcPr>
           <w:p>
@@ -3990,12 +3973,12 @@
             </w:pPr>
             <w:r>
               <w:rPr>
-                <w:sz w:val="16"/>
+                <w:sz w:val="18"/>
               </w:rPr>
             </w:r>
             <w:r>
               <w:rPr>
-                <w:sz w:val="16"/>
+                <w:sz w:val="18"/>
               </w:rPr>
               <w:t>Initial plan aligned to LedgerPilot SRS</w:t>
             </w:r>
@@ -4008,7 +3991,7 @@
         </w:trPr>
         <w:tc>
           <w:tcPr>
-            <w:tcW w:type="dxa" w:w="3331"/>
+            <w:tcW w:type="dxa" w:w="1008"/>
             <w:vAlign w:val="top"/>
           </w:tcPr>
           <w:p>
@@ -4017,12 +4000,12 @@
             </w:pPr>
             <w:r>
               <w:rPr>
-                <w:sz w:val="16"/>
+                <w:sz w:val="18"/>
               </w:rPr>
             </w:r>
             <w:r>
               <w:rPr>
-                <w:sz w:val="16"/>
+                <w:sz w:val="18"/>
               </w:rPr>
               <w:t>2.0</w:t>
             </w:r>
@@ -4030,7 +4013,7 @@
         </w:tc>
         <w:tc>
           <w:tcPr>
-            <w:tcW w:type="dxa" w:w="3331"/>
+            <w:tcW w:type="dxa" w:w="1800"/>
             <w:vAlign w:val="top"/>
           </w:tcPr>
           <w:p>
@@ -4039,12 +4022,12 @@
             </w:pPr>
             <w:r>
               <w:rPr>
-                <w:sz w:val="16"/>
+                <w:sz w:val="18"/>
               </w:rPr>
             </w:r>
             <w:r>
               <w:rPr>
-                <w:sz w:val="16"/>
+                <w:sz w:val="18"/>
               </w:rPr>
               <w:t>27 Oct 2026</w:t>
             </w:r>
@@ -4052,7 +4035,7 @@
         </w:tc>
         <w:tc>
           <w:tcPr>
-            <w:tcW w:type="dxa" w:w="3331"/>
+            <w:tcW w:type="dxa" w:w="7186"/>
             <w:vAlign w:val="top"/>
           </w:tcPr>
           <w:p>
@@ -4061,14 +4044,9 @@
             </w:pPr>
             <w:r>
               <w:rPr>
-                <w:sz w:val="16"/>
+                <w:sz w:val="18"/>
               </w:rPr>
-            </w:r>
-            <w:r>
-              <w:rPr>
-                <w:sz w:val="16"/>
-              </w:rPr>
-              <w:t>Reordered to requested development sequence; preserved LedgerPilot architecture and clarified P1, Supabase/Auth and public API/SDK boundaries</w:t>
+              <w:t>Resequenced plan to match LedgerPilot scope</w:t>
             </w:r>
           </w:p>
         </w:tc>
@@ -4079,7 +4057,7 @@
         </w:trPr>
         <w:tc>
           <w:tcPr>
-            <w:tcW w:type="dxa" w:w="3331"/>
+            <w:tcW w:type="dxa" w:w="1008"/>
             <w:vAlign w:val="top"/>
           </w:tcPr>
           <w:p>
@@ -4088,12 +4066,12 @@
             </w:pPr>
             <w:r>
               <w:rPr>
-                <w:sz w:val="16"/>
+                <w:sz w:val="18"/>
               </w:rPr>
             </w:r>
             <w:r>
               <w:rPr>
-                <w:sz w:val="16"/>
+                <w:sz w:val="18"/>
               </w:rPr>
               <w:t>2.1</w:t>
             </w:r>
@@ -4101,7 +4079,7 @@
         </w:tc>
         <w:tc>
           <w:tcPr>
-            <w:tcW w:type="dxa" w:w="3331"/>
+            <w:tcW w:type="dxa" w:w="1800"/>
             <w:vAlign w:val="top"/>
           </w:tcPr>
           <w:p>
@@ -4110,12 +4088,12 @@
             </w:pPr>
             <w:r>
               <w:rPr>
-                <w:sz w:val="16"/>
+                <w:sz w:val="18"/>
               </w:rPr>
             </w:r>
             <w:r>
               <w:rPr>
-                <w:sz w:val="16"/>
+                <w:sz w:val="18"/>
               </w:rPr>
               <w:t>27 Oct 2026</w:t>
             </w:r>
@@ -4123,7 +4101,7 @@
         </w:tc>
         <w:tc>
           <w:tcPr>
-            <w:tcW w:type="dxa" w:w="3331"/>
+            <w:tcW w:type="dxa" w:w="7186"/>
             <w:vAlign w:val="top"/>
           </w:tcPr>
           <w:p>
@@ -4132,14 +4110,9 @@
             </w:pPr>
             <w:r>
               <w:rPr>
-                <w:sz w:val="16"/>
+                <w:sz w:val="18"/>
               </w:rPr>
-            </w:r>
-            <w:r>
-              <w:rPr>
-                <w:sz w:val="16"/>
-              </w:rPr>
-              <w:t>Aligned the database driver with the SRS-selected psycopg and added LedgerPilot-specific engineering standards and ADRs</w:t>
+              <w:t>Added project standards and ADRs</w:t>
             </w:r>
           </w:p>
         </w:tc>
@@ -4147,31 +4120,49 @@
       <w:tr>
         <w:tc>
           <w:tcPr>
-            <w:tcW w:type="dxa" w:w="3331"/>
+            <w:tcW w:type="dxa" w:w="1008"/>
           </w:tcPr>
           <w:p>
+            <w:pPr>
+              <w:spacing w:after="40" w:line="240" w:lineRule="auto"/>
+            </w:pPr>
             <w:r>
+              <w:rPr>
+                <w:sz w:val="18"/>
+              </w:rPr>
               <w:t>2.2</w:t>
             </w:r>
           </w:p>
         </w:tc>
         <w:tc>
           <w:tcPr>
-            <w:tcW w:type="dxa" w:w="3331"/>
+            <w:tcW w:type="dxa" w:w="1800"/>
           </w:tcPr>
           <w:p>
+            <w:pPr>
+              <w:spacing w:after="40" w:line="240" w:lineRule="auto"/>
+            </w:pPr>
             <w:r>
+              <w:rPr>
+                <w:sz w:val="18"/>
+              </w:rPr>
               <w:t>27 Oct 2026</w:t>
             </w:r>
           </w:p>
         </w:tc>
         <w:tc>
           <w:tcPr>
-            <w:tcW w:type="dxa" w:w="3331"/>
+            <w:tcW w:type="dxa" w:w="7186"/>
           </w:tcPr>
           <w:p>
+            <w:pPr>
+              <w:spacing w:after="40" w:line="240" w:lineRule="auto"/>
+            </w:pPr>
             <w:r>
-              <w:t>Added the current implementation tracker and a gated Vercel web plus AWS EC2 demo CI/CD path using ECR, SSM, OIDC, health checks and rollback; recorded verification and activation dependencies</w:t>
+              <w:rPr>
+                <w:sz w:val="18"/>
+              </w:rPr>
+              <w:t>Added progress tracker and demo CI/CD</w:t>
             </w:r>
           </w:p>
         </w:tc>
@@ -4179,31 +4170,199 @@
       <w:tr>
         <w:tc>
           <w:tcPr>
-            <w:tcW w:type="dxa" w:w="3331"/>
+            <w:tcW w:type="dxa" w:w="1008"/>
           </w:tcPr>
           <w:p>
+            <w:pPr>
+              <w:spacing w:after="40" w:line="240" w:lineRule="auto"/>
+            </w:pPr>
             <w:r>
+              <w:rPr>
+                <w:sz w:val="18"/>
+              </w:rPr>
               <w:t>2.3</w:t>
             </w:r>
           </w:p>
         </w:tc>
         <w:tc>
           <w:tcPr>
-            <w:tcW w:type="dxa" w:w="3331"/>
+            <w:tcW w:type="dxa" w:w="1800"/>
           </w:tcPr>
           <w:p>
+            <w:pPr>
+              <w:spacing w:after="40" w:line="240" w:lineRule="auto"/>
+            </w:pPr>
             <w:r>
+              <w:rPr>
+                <w:sz w:val="18"/>
+              </w:rPr>
               <w:t>27 Oct 2026</w:t>
             </w:r>
           </w:p>
         </w:tc>
         <w:tc>
           <w:tcPr>
-            <w:tcW w:type="dxa" w:w="3331"/>
+            <w:tcW w:type="dxa" w:w="7186"/>
           </w:tcPr>
           <w:p>
+            <w:pPr>
+              <w:spacing w:after="40" w:line="240" w:lineRule="auto"/>
+            </w:pPr>
             <w:r>
-              <w:t>Implemented Phase 0 contributor/issue templates, clean setup and reset guidance, Compose health validation, and local backend/frontend quality gates; recorded Docker/remote CI blockers without marking the phase complete</w:t>
+              <w:rPr>
+                <w:sz w:val="18"/>
+              </w:rPr>
+              <w:t>Phase 0 scaffold; Docker/hosted CI pending</w:t>
+            </w:r>
+          </w:p>
+        </w:tc>
+      </w:tr>
+      <w:tr>
+        <w:tc>
+          <w:tcPr>
+            <w:tcW w:type="dxa" w:w="1008"/>
+          </w:tcPr>
+          <w:p>
+            <w:pPr>
+              <w:spacing w:after="40" w:line="240" w:lineRule="auto"/>
+            </w:pPr>
+            <w:r>
+              <w:rPr>
+                <w:sz w:val="18"/>
+              </w:rPr>
+              <w:t>2.4</w:t>
+            </w:r>
+          </w:p>
+        </w:tc>
+        <w:tc>
+          <w:tcPr>
+            <w:tcW w:type="dxa" w:w="1800"/>
+          </w:tcPr>
+          <w:p>
+            <w:pPr>
+              <w:spacing w:after="40" w:line="240" w:lineRule="auto"/>
+            </w:pPr>
+            <w:r>
+              <w:rPr>
+                <w:sz w:val="18"/>
+              </w:rPr>
+              <w:t>27 Oct 2026</w:t>
+            </w:r>
+          </w:p>
+        </w:tc>
+        <w:tc>
+          <w:tcPr>
+            <w:tcW w:type="dxa" w:w="7186"/>
+          </w:tcPr>
+          <w:p>
+            <w:pPr>
+              <w:spacing w:after="40" w:line="240" w:lineRule="auto"/>
+            </w:pPr>
+            <w:r>
+              <w:rPr>
+                <w:sz w:val="18"/>
+              </w:rPr>
+              <w:t>Began Phase 1 setup</w:t>
+            </w:r>
+          </w:p>
+        </w:tc>
+      </w:tr>
+      <w:tr>
+        <w:tc>
+          <w:tcPr>
+            <w:tcW w:type="dxa" w:w="1008"/>
+          </w:tcPr>
+          <w:p>
+            <w:pPr>
+              <w:spacing w:after="40" w:line="240" w:lineRule="auto"/>
+            </w:pPr>
+            <w:r>
+              <w:rPr>
+                <w:sz w:val="18"/>
+              </w:rPr>
+              <w:t>2.5</w:t>
+            </w:r>
+          </w:p>
+        </w:tc>
+        <w:tc>
+          <w:tcPr>
+            <w:tcW w:type="dxa" w:w="1800"/>
+          </w:tcPr>
+          <w:p>
+            <w:pPr>
+              <w:spacing w:after="40" w:line="240" w:lineRule="auto"/>
+            </w:pPr>
+            <w:r>
+              <w:rPr>
+                <w:sz w:val="18"/>
+              </w:rPr>
+              <w:t>27 Oct 2026</w:t>
+            </w:r>
+          </w:p>
+        </w:tc>
+        <w:tc>
+          <w:tcPr>
+            <w:tcW w:type="dxa" w:w="7186"/>
+          </w:tcPr>
+          <w:p>
+            <w:pPr>
+              <w:spacing w:after="40" w:line="240" w:lineRule="auto"/>
+            </w:pPr>
+            <w:r>
+              <w:rPr>
+                <w:sz w:val="18"/>
+              </w:rPr>
+              <w:t>Completed local Phase 1 configuration and live database checks</w:t>
+            </w:r>
+          </w:p>
+        </w:tc>
+      </w:tr>
+      <w:tr>
+        <w:tc>
+          <w:tcPr>
+            <w:tcW w:type="dxa" w:w="1008"/>
+          </w:tcPr>
+          <w:p>
+            <w:pPr>
+              <w:spacing w:after="40" w:line="240" w:lineRule="auto"/>
+            </w:pPr>
+            <w:r>
+              <w:rPr>
+                <w:sz w:val="18"/>
+              </w:rPr>
+              <w:t>2.6</w:t>
+            </w:r>
+          </w:p>
+        </w:tc>
+        <w:tc>
+          <w:tcPr>
+            <w:tcW w:type="dxa" w:w="1800"/>
+          </w:tcPr>
+          <w:p>
+            <w:pPr>
+              <w:spacing w:after="40" w:line="240" w:lineRule="auto"/>
+            </w:pPr>
+            <w:r>
+              <w:rPr>
+                <w:sz w:val="18"/>
+              </w:rPr>
+              <w:t>27 Oct 2026</w:t>
+            </w:r>
+          </w:p>
+        </w:tc>
+        <w:tc>
+          <w:tcPr>
+            <w:tcW w:type="dxa" w:w="7186"/>
+          </w:tcPr>
+          <w:p>
+            <w:pPr>
+              <w:spacing w:after="40" w:line="240" w:lineRule="auto"/>
+            </w:pPr>
+            <w:r>
+              <w:rPr>
+                <w:sz w:val="18"/>
+              </w:rPr>
+              <w:t>Audited configuration, bootstrap and CI; verified API image</w:t>
             </w:r>
           </w:p>
         </w:tc>
@@ -4227,7 +4386,10 @@
     <w:p>
       <w:pPr/>
       <w:r>
-        <w:t>Current phase: Phase 0 — repository and uv setup (in progress). The repository scaffold, local setup documents, and CI/CD definitions exist. Backend and frontend checks pass locally, but PostgreSQL/container execution and a GitHub-hosted CI run remain unverified, so the Phase 0 exit gate is not met.</w:t>
+        <w:t>Current phase: Phase 0 local foundation checks pass, including the API image build and non-root HTTP/health/OpenAPI smoke test. Its formal exit remains open for successful GitHub-hosted CI. A Git remote is now configured; these audit changes have not been pushed.</w:t>
+        <w:br/>
+        <w:br/>
+        <w:t>Phase 1: Complete for the selected local services. FastAPI-owned JWT access cookies and stored rotating refresh tokens are documented; the local PostgreSQL runtime/migration roles, private credential file, configuration validation, denied-operation checks and password-rotation drill pass. LedgerPilot uses loopback port 55432 because another local service uses 5432. No hosted service was provisioned. Auth endpoints, tenant schema/RLS and the configured API pool remain Phase 2 work. See docs/phase-1-service-setup.md and docs/auth-session-contract.md.</w:t>
       </w:r>
     </w:p>
     <w:p>
@@ -4243,7 +4405,7 @@
         <w:pStyle w:val="ListBullet"/>
       </w:pPr>
       <w:r>
-        <w:t>.github/workflows/quality.yml: locked backend checks/tests, frontend production build/artifact, API container build, and gated AWS demo deploy after required CI jobs.</w:t>
+        <w:t>.github/workflows/checks.yml and quality.yml: shared locked backend checks/tests, frontend production build/artifact, API container build, and gated AWS demo deploy after required CI jobs.</w:t>
       </w:r>
     </w:p>
     <w:p>
@@ -4251,7 +4413,7 @@
         <w:pStyle w:val="ListBullet"/>
       </w:pPr>
       <w:r>
-        <w:t>.github/workflows/release.yml: version-tagged API image publishing to GitHub Container Registry.</w:t>
+        <w:t>.github/workflows/release.yml: required checks before publishing the built API image to GitHub Container Registry.</w:t>
       </w:r>
     </w:p>
     <w:p>
@@ -4292,6 +4454,22 @@
       </w:pPr>
       <w:r>
         <w:t>scripts/reset-local-db.ps1 and docker-compose.yml: parameterized PostgreSQL health check and confirmation-gated local data reset.</w:t>
+      </w:r>
+    </w:p>
+    <w:p>
+      <w:pPr>
+        <w:pStyle w:val="ListBullet"/>
+      </w:pPr>
+      <w:r>
+        <w:t>.env.example and private .env: distinct local runtime/migration credentials and matching URLs; operator helper prepares secrets without printing values. Local PostgreSQL uses loopback port 55432.</w:t>
+      </w:r>
+    </w:p>
+    <w:p>
+      <w:pPr>
+        <w:pStyle w:val="ListBullet"/>
+      </w:pPr>
+      <w:r>
+        <w:t>backend/db/init/01-roles.sql and scripts/bootstrap-local-db.ps1: separate local runtime/migration roles, schema privileges and explicit bootstrap for an existing local volume.</w:t>
       </w:r>
     </w:p>
     <w:p>
@@ -4305,15 +4483,17 @@
     <w:p>
       <w:pPr/>
       <w:r>
-        <w:t>uv sync --locked --all-groups, Ruff, mypy, pytest/coverage (1 scaffold test passed), and Python source compilation passed locally. npm ci and the frontend production build passed. docker compose config --quiet passed. Docker Desktop's Linux engine did not become available; WSL returned access denied, so PostgreSQL was not started and the API image was not built. This checkout has no Git remote, so GitHub-hosted CI could not be run.</w:t>
+        <w:t>38 tests pass, including five real PostgreSQL bootstrap rejection cases. Ruff, mypy, frontend production build, database grant/DDL-denial verification, API image build and container HTTP/health/OpenAPI checks pass. All workflows pass actionlint. Prior Phase 1 password-rotation evidence remains recorded. Credentials remain ignored. Hosted CI and deployment remain unverified.</w:t>
       </w:r>
     </w:p>
     <w:p>
-      <w:pPr>
-        <w:pStyle w:val="ListBullet"/>
-      </w:pPr>
       <w:r>
-        <w:t>Link Vercel to the repository and configure frontend/ as project root, npm run build, dist output, and the selected GitHub default branch.</w:t>
+        <w:t>Phase 1 implementation: local credential helper, startup validation and bounded pool settings, auth-session contract, credential rotation/fallback inventory and isolated PostgreSQL CI checks. Authentication routes, tenant RLS and API pool implementation remain Phase 2 work.</w:t>
+      </w:r>
+    </w:p>
+    <w:p>
+      <w:r>
+        <w:t>Audit fixes: Block connection query overrides; isolate file validation; reject unsafe SQL bootstrap inputs; restrict Docker context; require shared checks before release; publish the built image; gate demo deployment on an explicit enable flag and default branch, validating environment values inside the job. See Phase 0 and Phase 1 audit. Full findings and evidence: docs/phase-0-1-audit.md.</w:t>
       </w:r>
     </w:p>
     <w:p>
@@ -4329,7 +4509,7 @@
         <w:pStyle w:val="ListBullet"/>
       </w:pPr>
       <w:r>
-        <w:t>Configure a Git remote and run CI on GitHub; require backend, frontend and container checks on the selected default branch. No remote is configured in this checkout.</w:t>
+        <w:t>Protect the default branch with required checks. The Git remote is configured; hosted verification remains pending.</w:t>
       </w:r>
     </w:p>
     <w:p>
@@ -4337,7 +4517,15 @@
         <w:pStyle w:val="ListBullet"/>
       </w:pPr>
       <w:r>
-        <w:t>Start Docker Desktop/WSL successfully; bring PostgreSQL to healthy state and build the API image locally or on GitHub.</w:t>
+        <w:t>Run revised workflows on GitHub and capture passing checks; the local image build passes.</w:t>
+      </w:r>
+    </w:p>
+    <w:p>
+      <w:pPr>
+        <w:pStyle w:val="ListBullet"/>
+      </w:pPr>
+      <w:r>
+        <w:t>Link Vercel to the repository and configure frontend/ as project root, npm run build, dist output, and the selected GitHub default branch.</w:t>
       </w:r>
     </w:p>
     <w:p>
@@ -4542,7 +4730,7 @@
         <w:color w:val="000000"/>
         <w:sz w:val="16"/>
       </w:rPr>
-      <w:t>LEDGERPILOT  |  IMPLEMENTATION PLAN  |  v2.3</w:t>
+      <w:t>LEDGERPILOT  |  IMPLEMENTATION PLAN  |  v2.6</w:t>
     </w:r>
   </w:p>
 </w:hdr>

</xml_diff>